<commit_message>
docs: actualizar plan de pruebas con cambios finales
</commit_message>
<xml_diff>
--- a/Plan_de_Pruebas_RPA_Migracion.docx
+++ b/Plan_de_Pruebas_RPA_Migracion.docx
@@ -90,7 +90,14 @@
           <w:sz w:val="24"/>
           <w:lang w:val="es-CO"/>
         </w:rPr>
-        <w:t>Autor: José Santiago</w:t>
+        <w:t>Autor: Jos</w:t>
+      </w:r>
+      <w:r>
+        <w:rPr>
+          <w:sz w:val="24"/>
+          <w:lang w:val="es-CO"/>
+        </w:rPr>
+        <w:t>e Santiago Jimenez Carranza</w:t>
       </w:r>
     </w:p>
     <w:p>
@@ -132,35 +139,7 @@
         <w:rPr>
           <w:lang w:val="es-CO"/>
         </w:rPr>
-        <w:t>Validar que la automatización desarrollada en Java lee correctamente el archivo Excel de estructura (DetalleTecnico.xlsx), genera valores para los 294 campos respetando tipos, longitudes, reglas de negocio y listas de referencia, y produce un archivo plano .</w:t>
-      </w:r>
-      <w:proofErr w:type="spellStart"/>
-      <w:r>
-        <w:rPr>
-          <w:lang w:val="es-CO"/>
-        </w:rPr>
-        <w:t>txt</w:t>
-      </w:r>
-      <w:proofErr w:type="spellEnd"/>
-      <w:r>
-        <w:rPr>
-          <w:lang w:val="es-CO"/>
-        </w:rPr>
-        <w:t xml:space="preserve"> con N registros parametrizados desde escenarios BDD </w:t>
-      </w:r>
-      <w:proofErr w:type="spellStart"/>
-      <w:r>
-        <w:rPr>
-          <w:lang w:val="es-CO"/>
-        </w:rPr>
-        <w:t>Gherkin</w:t>
-      </w:r>
-      <w:proofErr w:type="spellEnd"/>
-      <w:r>
-        <w:rPr>
-          <w:lang w:val="es-CO"/>
-        </w:rPr>
-        <w:t>.</w:t>
+        <w:t>Validar que la automatización desarrollada en Java lee correctamente el archivo Excel de estructura (DetalleTecnico.xlsx), genera valores para los 294 campos respetando tipos, longitudes, reglas de negocio y listas de referencia, y produce un archivo plano .txt con N registros parametrizados desde escenarios BDD Gherkin.</w:t>
       </w:r>
     </w:p>
     <w:p>
@@ -202,21 +181,7 @@
         <w:rPr>
           <w:lang w:val="es-CO"/>
         </w:rPr>
-        <w:t xml:space="preserve">Lectura y </w:t>
-      </w:r>
-      <w:proofErr w:type="spellStart"/>
-      <w:r>
-        <w:rPr>
-          <w:lang w:val="es-CO"/>
-        </w:rPr>
-        <w:t>parsing</w:t>
-      </w:r>
-      <w:proofErr w:type="spellEnd"/>
-      <w:r>
-        <w:rPr>
-          <w:lang w:val="es-CO"/>
-        </w:rPr>
-        <w:t xml:space="preserve"> del archivo Excel de estructura (294 campos)</w:t>
+        <w:t>Lectura y parsing del archivo Excel de estructura (294 campos)</w:t>
       </w:r>
     </w:p>
     <w:p>
@@ -272,43 +237,21 @@
         <w:rPr>
           <w:lang w:val="es-CO"/>
         </w:rPr>
-        <w:t xml:space="preserve">Generación parametrizada de N registros vía BDD </w:t>
+        <w:t>Generación parametrizada de N registros vía BDD Gherkin</w:t>
       </w:r>
-      <w:proofErr w:type="spellStart"/>
+    </w:p>
+    <w:p>
+      <w:pPr>
+        <w:pStyle w:val="Listaconvietas"/>
+        <w:rPr>
+          <w:lang w:val="es-CO"/>
+        </w:rPr>
+      </w:pPr>
       <w:r>
         <w:rPr>
           <w:lang w:val="es-CO"/>
         </w:rPr>
-        <w:t>Gherkin</w:t>
-      </w:r>
-      <w:proofErr w:type="spellEnd"/>
-    </w:p>
-    <w:p>
-      <w:pPr>
-        <w:pStyle w:val="Listaconvietas"/>
-        <w:rPr>
-          <w:lang w:val="es-CO"/>
-        </w:rPr>
-      </w:pPr>
-      <w:r>
-        <w:rPr>
-          <w:lang w:val="es-CO"/>
-        </w:rPr>
-        <w:t>Formato correcto del archivo plano de salida (.</w:t>
-      </w:r>
-      <w:proofErr w:type="spellStart"/>
-      <w:r>
-        <w:rPr>
-          <w:lang w:val="es-CO"/>
-        </w:rPr>
-        <w:t>txt</w:t>
-      </w:r>
-      <w:proofErr w:type="spellEnd"/>
-      <w:r>
-        <w:rPr>
-          <w:lang w:val="es-CO"/>
-        </w:rPr>
-        <w:t>)</w:t>
+        <w:t>Formato correcto del archivo plano de salida (.txt)</w:t>
       </w:r>
     </w:p>
     <w:p>
@@ -372,33 +315,11 @@
       <w:pPr>
         <w:pStyle w:val="Ttulo3"/>
       </w:pPr>
-      <w:proofErr w:type="spellStart"/>
       <w:r>
         <w:rPr>
           <w:color w:val="2E75B6"/>
         </w:rPr>
-        <w:t>Criterios</w:t>
-      </w:r>
-      <w:proofErr w:type="spellEnd"/>
-      <w:r>
-        <w:rPr>
-          <w:color w:val="2E75B6"/>
-        </w:rPr>
-        <w:t xml:space="preserve"> de </w:t>
-      </w:r>
-      <w:proofErr w:type="spellStart"/>
-      <w:r>
-        <w:rPr>
-          <w:color w:val="2E75B6"/>
-        </w:rPr>
-        <w:t>Aceptación</w:t>
-      </w:r>
-      <w:proofErr w:type="spellEnd"/>
-      <w:r>
-        <w:rPr>
-          <w:color w:val="2E75B6"/>
-        </w:rPr>
-        <w:t>:</w:t>
+        <w:t>Criterios de Aceptación:</w:t>
       </w:r>
     </w:p>
     <w:p>
@@ -412,21 +333,7 @@
         <w:rPr>
           <w:lang w:val="es-CO"/>
         </w:rPr>
-        <w:t xml:space="preserve">CA-01: El sistema debe cargar exactamente 294 campos desde la hoja </w:t>
-      </w:r>
-      <w:proofErr w:type="spellStart"/>
-      <w:r>
-        <w:rPr>
-          <w:lang w:val="es-CO"/>
-        </w:rPr>
-        <w:t>DetalleTécnico</w:t>
-      </w:r>
-      <w:proofErr w:type="spellEnd"/>
-      <w:r>
-        <w:rPr>
-          <w:lang w:val="es-CO"/>
-        </w:rPr>
-        <w:t>.</w:t>
+        <w:t>CA-01: El sistema debe cargar exactamente 294 campos desde la hoja DetalleTécnico.</w:t>
       </w:r>
     </w:p>
     <w:p>
@@ -453,13 +360,8 @@
         </w:rPr>
         <w:t xml:space="preserve">CA-03: Las 15 listas de referencia deben estar cargadas (TIP ID CLIENTE, DANE, LINEAS, CONVENIOS, Cod. </w:t>
       </w:r>
-      <w:proofErr w:type="spellStart"/>
       <w:r>
-        <w:t>Aseguradoras</w:t>
-      </w:r>
-      <w:proofErr w:type="spellEnd"/>
-      <w:r>
-        <w:t>, etc.).</w:t>
+        <w:t>Aseguradoras, etc.).</w:t>
       </w:r>
     </w:p>
     <w:p>
@@ -501,82 +403,32 @@
         <w:rPr>
           <w:lang w:val="es-CO"/>
         </w:rPr>
-        <w:t>Como usuario, quiero generar un archivo plano .</w:t>
+        <w:t>Como usuario, quiero generar un archivo plano .txt con una cantidad parametrizable de registros, donde cada registro respete la estructura de posiciones fijas definida en el Excel.</w:t>
       </w:r>
-      <w:proofErr w:type="spellStart"/>
+    </w:p>
+    <w:p>
+      <w:pPr>
+        <w:pStyle w:val="Ttulo3"/>
+      </w:pPr>
+      <w:r>
+        <w:rPr>
+          <w:color w:val="2E75B6"/>
+        </w:rPr>
+        <w:t>Criterios de Aceptación:</w:t>
+      </w:r>
+    </w:p>
+    <w:p>
+      <w:pPr>
+        <w:pStyle w:val="Listaconvietas"/>
+        <w:rPr>
+          <w:lang w:val="es-CO"/>
+        </w:rPr>
+      </w:pPr>
       <w:r>
         <w:rPr>
           <w:lang w:val="es-CO"/>
         </w:rPr>
-        <w:t>txt</w:t>
-      </w:r>
-      <w:proofErr w:type="spellEnd"/>
-      <w:r>
-        <w:rPr>
-          <w:lang w:val="es-CO"/>
-        </w:rPr>
-        <w:t xml:space="preserve"> con una cantidad parametrizable de registros, donde cada registro respete la estructura de posiciones fijas definida en el Excel.</w:t>
-      </w:r>
-    </w:p>
-    <w:p>
-      <w:pPr>
-        <w:pStyle w:val="Ttulo3"/>
-      </w:pPr>
-      <w:proofErr w:type="spellStart"/>
-      <w:r>
-        <w:rPr>
-          <w:color w:val="2E75B6"/>
-        </w:rPr>
-        <w:t>Criterios</w:t>
-      </w:r>
-      <w:proofErr w:type="spellEnd"/>
-      <w:r>
-        <w:rPr>
-          <w:color w:val="2E75B6"/>
-        </w:rPr>
-        <w:t xml:space="preserve"> de </w:t>
-      </w:r>
-      <w:proofErr w:type="spellStart"/>
-      <w:r>
-        <w:rPr>
-          <w:color w:val="2E75B6"/>
-        </w:rPr>
-        <w:t>Aceptación</w:t>
-      </w:r>
-      <w:proofErr w:type="spellEnd"/>
-      <w:r>
-        <w:rPr>
-          <w:color w:val="2E75B6"/>
-        </w:rPr>
-        <w:t>:</w:t>
-      </w:r>
-    </w:p>
-    <w:p>
-      <w:pPr>
-        <w:pStyle w:val="Listaconvietas"/>
-        <w:rPr>
-          <w:lang w:val="es-CO"/>
-        </w:rPr>
-      </w:pPr>
-      <w:r>
-        <w:rPr>
-          <w:lang w:val="es-CO"/>
-        </w:rPr>
-        <w:t xml:space="preserve">CA-01: El archivo de salida debe contener exactamente N registros (líneas), donde N es parametrizado desde el escenario </w:t>
-      </w:r>
-      <w:proofErr w:type="spellStart"/>
-      <w:r>
-        <w:rPr>
-          <w:lang w:val="es-CO"/>
-        </w:rPr>
-        <w:t>Gherkin</w:t>
-      </w:r>
-      <w:proofErr w:type="spellEnd"/>
-      <w:r>
-        <w:rPr>
-          <w:lang w:val="es-CO"/>
-        </w:rPr>
-        <w:t>.</w:t>
+        <w:t>CA-01: El archivo de salida debe contener exactamente N registros (líneas), donde N es parametrizado desde el escenario Gherkin.</w:t>
       </w:r>
     </w:p>
     <w:p>
@@ -653,33 +505,11 @@
       <w:pPr>
         <w:pStyle w:val="Ttulo3"/>
       </w:pPr>
-      <w:proofErr w:type="spellStart"/>
       <w:r>
         <w:rPr>
           <w:color w:val="2E75B6"/>
         </w:rPr>
-        <w:t>Criterios</w:t>
-      </w:r>
-      <w:proofErr w:type="spellEnd"/>
-      <w:r>
-        <w:rPr>
-          <w:color w:val="2E75B6"/>
-        </w:rPr>
-        <w:t xml:space="preserve"> de </w:t>
-      </w:r>
-      <w:proofErr w:type="spellStart"/>
-      <w:r>
-        <w:rPr>
-          <w:color w:val="2E75B6"/>
-        </w:rPr>
-        <w:t>Aceptación</w:t>
-      </w:r>
-      <w:proofErr w:type="spellEnd"/>
-      <w:r>
-        <w:rPr>
-          <w:color w:val="2E75B6"/>
-        </w:rPr>
-        <w:t>:</w:t>
+        <w:t>Criterios de Aceptación:</w:t>
       </w:r>
     </w:p>
     <w:p>
@@ -721,21 +551,7 @@
         <w:rPr>
           <w:lang w:val="es-CO"/>
         </w:rPr>
-        <w:t>CA-03: Los campos NUMERICO con decimales deben concatenar enteros + decimales sin separador (</w:t>
-      </w:r>
-      <w:proofErr w:type="spellStart"/>
-      <w:r>
-        <w:rPr>
-          <w:lang w:val="es-CO"/>
-        </w:rPr>
-        <w:t>ej</w:t>
-      </w:r>
-      <w:proofErr w:type="spellEnd"/>
-      <w:r>
-        <w:rPr>
-          <w:lang w:val="es-CO"/>
-        </w:rPr>
-        <w:t>: 12 enteros + 2 decimales = 14 caracteres).</w:t>
+        <w:t>CA-03: Los campos NUMERICO con decimales deben concatenar enteros + decimales sin separador (ej: 12 enteros + 2 decimales = 14 caracteres).</w:t>
       </w:r>
     </w:p>
     <w:p>
@@ -799,33 +615,11 @@
       <w:pPr>
         <w:pStyle w:val="Ttulo3"/>
       </w:pPr>
-      <w:proofErr w:type="spellStart"/>
       <w:r>
         <w:rPr>
           <w:color w:val="2E75B6"/>
         </w:rPr>
-        <w:t>Criterios</w:t>
-      </w:r>
-      <w:proofErr w:type="spellEnd"/>
-      <w:r>
-        <w:rPr>
-          <w:color w:val="2E75B6"/>
-        </w:rPr>
-        <w:t xml:space="preserve"> de </w:t>
-      </w:r>
-      <w:proofErr w:type="spellStart"/>
-      <w:r>
-        <w:rPr>
-          <w:color w:val="2E75B6"/>
-        </w:rPr>
-        <w:t>Aceptación</w:t>
-      </w:r>
-      <w:proofErr w:type="spellEnd"/>
-      <w:r>
-        <w:rPr>
-          <w:color w:val="2E75B6"/>
-        </w:rPr>
-        <w:t>:</w:t>
+        <w:t>Criterios de Aceptación:</w:t>
       </w:r>
     </w:p>
     <w:p>
@@ -861,23 +655,7 @@
         <w:pStyle w:val="Listaconvietas"/>
       </w:pPr>
       <w:r>
-        <w:t xml:space="preserve">CA-03: VALSLDACT-IN </w:t>
-      </w:r>
-      <w:proofErr w:type="spellStart"/>
-      <w:r>
-        <w:t>debe</w:t>
-      </w:r>
-      <w:proofErr w:type="spellEnd"/>
-      <w:r>
-        <w:t xml:space="preserve"> ser </w:t>
-      </w:r>
-      <w:proofErr w:type="spellStart"/>
-      <w:r>
-        <w:t>igual</w:t>
-      </w:r>
-      <w:proofErr w:type="spellEnd"/>
-      <w:r>
-        <w:t xml:space="preserve"> a CAPVIGACT-IN + CAPVENCI-IN.</w:t>
+        <w:t>CA-03: VALSLDACT-IN debe ser igual a CAPVIGACT-IN + CAPVENCI-IN.</w:t>
       </w:r>
     </w:p>
     <w:p>
@@ -919,21 +697,7 @@
         <w:rPr>
           <w:lang w:val="es-CO"/>
         </w:rPr>
-        <w:t xml:space="preserve">CA-06: CLASECAR-IN debe corresponder al mapeo de CODLINCRE-IN según la hoja </w:t>
-      </w:r>
-      <w:proofErr w:type="spellStart"/>
-      <w:r>
-        <w:rPr>
-          <w:lang w:val="es-CO"/>
-        </w:rPr>
-        <w:t>Lineas</w:t>
-      </w:r>
-      <w:proofErr w:type="spellEnd"/>
-      <w:r>
-        <w:rPr>
-          <w:lang w:val="es-CO"/>
-        </w:rPr>
-        <w:t xml:space="preserve"> (C=Comercial, O=Consumo, H=Vivienda, M=Microcrédito).</w:t>
+        <w:t>CA-06: CLASECAR-IN debe corresponder al mapeo de CODLINCRE-IN según la hoja Lineas (C=Comercial, O=Consumo, H=Vivienda, M=Microcrédito).</w:t>
       </w:r>
     </w:p>
     <w:p>
@@ -996,33 +760,11 @@
       <w:pPr>
         <w:pStyle w:val="Ttulo3"/>
       </w:pPr>
-      <w:proofErr w:type="spellStart"/>
       <w:r>
         <w:rPr>
           <w:color w:val="2E75B6"/>
         </w:rPr>
-        <w:t>Criterios</w:t>
-      </w:r>
-      <w:proofErr w:type="spellEnd"/>
-      <w:r>
-        <w:rPr>
-          <w:color w:val="2E75B6"/>
-        </w:rPr>
-        <w:t xml:space="preserve"> de </w:t>
-      </w:r>
-      <w:proofErr w:type="spellStart"/>
-      <w:r>
-        <w:rPr>
-          <w:color w:val="2E75B6"/>
-        </w:rPr>
-        <w:t>Aceptación</w:t>
-      </w:r>
-      <w:proofErr w:type="spellEnd"/>
-      <w:r>
-        <w:rPr>
-          <w:color w:val="2E75B6"/>
-        </w:rPr>
-        <w:t>:</w:t>
+        <w:t>Criterios de Aceptación:</w:t>
       </w:r>
     </w:p>
     <w:p>
@@ -1050,77 +792,35 @@
         <w:rPr>
           <w:lang w:val="es-CO"/>
         </w:rPr>
-        <w:t xml:space="preserve">CA-02: CIUCLI-IN debe contener códigos DANE válidos de la hoja </w:t>
+        <w:t>CA-02: CIUCLI-IN debe contener códigos DANE válidos de la hoja CodigoDANE.</w:t>
       </w:r>
-      <w:proofErr w:type="spellStart"/>
+    </w:p>
+    <w:p>
+      <w:pPr>
+        <w:pStyle w:val="Listaconvietas"/>
+        <w:rPr>
+          <w:lang w:val="es-CO"/>
+        </w:rPr>
+      </w:pPr>
       <w:r>
         <w:rPr>
           <w:lang w:val="es-CO"/>
         </w:rPr>
-        <w:t>CodigoDANE</w:t>
+        <w:t>CA-03: CODLINCRE-IN debe contener códigos de la hoja Lineas de crédito.</w:t>
       </w:r>
-      <w:proofErr w:type="spellEnd"/>
+    </w:p>
+    <w:p>
+      <w:pPr>
+        <w:pStyle w:val="Listaconvietas"/>
+        <w:rPr>
+          <w:lang w:val="es-CO"/>
+        </w:rPr>
+      </w:pPr>
       <w:r>
         <w:rPr>
           <w:lang w:val="es-CO"/>
         </w:rPr>
-        <w:t>.</w:t>
-      </w:r>
-    </w:p>
-    <w:p>
-      <w:pPr>
-        <w:pStyle w:val="Listaconvietas"/>
-        <w:rPr>
-          <w:lang w:val="es-CO"/>
-        </w:rPr>
-      </w:pPr>
-      <w:r>
-        <w:rPr>
-          <w:lang w:val="es-CO"/>
-        </w:rPr>
-        <w:t xml:space="preserve">CA-03: CODLINCRE-IN debe contener códigos de la hoja </w:t>
-      </w:r>
-      <w:proofErr w:type="spellStart"/>
-      <w:r>
-        <w:rPr>
-          <w:lang w:val="es-CO"/>
-        </w:rPr>
-        <w:t>Lineas</w:t>
-      </w:r>
-      <w:proofErr w:type="spellEnd"/>
-      <w:r>
-        <w:rPr>
-          <w:lang w:val="es-CO"/>
-        </w:rPr>
-        <w:t xml:space="preserve"> de crédito.</w:t>
-      </w:r>
-    </w:p>
-    <w:p>
-      <w:pPr>
-        <w:pStyle w:val="Listaconvietas"/>
-        <w:rPr>
-          <w:lang w:val="es-CO"/>
-        </w:rPr>
-      </w:pPr>
-      <w:r>
-        <w:rPr>
-          <w:lang w:val="es-CO"/>
-        </w:rPr>
-        <w:t xml:space="preserve">CA-04: Los campos con </w:t>
-      </w:r>
-      <w:proofErr w:type="spellStart"/>
-      <w:r>
-        <w:rPr>
-          <w:lang w:val="es-CO"/>
-        </w:rPr>
-        <w:t>listaRef</w:t>
-      </w:r>
-      <w:proofErr w:type="spellEnd"/>
-      <w:r>
-        <w:rPr>
-          <w:lang w:val="es-CO"/>
-        </w:rPr>
-        <w:t xml:space="preserve"> definida deben generar valores exclusivamente de esa lista.</w:t>
+        <w:t>CA-04: Los campos con listaRef definida deben generar valores exclusivamente de esa lista.</w:t>
       </w:r>
     </w:p>
     <w:p>
@@ -1169,33 +869,11 @@
       <w:pPr>
         <w:pStyle w:val="Ttulo3"/>
       </w:pPr>
-      <w:proofErr w:type="spellStart"/>
       <w:r>
         <w:rPr>
           <w:color w:val="2E75B6"/>
         </w:rPr>
-        <w:t>Criterios</w:t>
-      </w:r>
-      <w:proofErr w:type="spellEnd"/>
-      <w:r>
-        <w:rPr>
-          <w:color w:val="2E75B6"/>
-        </w:rPr>
-        <w:t xml:space="preserve"> de </w:t>
-      </w:r>
-      <w:proofErr w:type="spellStart"/>
-      <w:r>
-        <w:rPr>
-          <w:color w:val="2E75B6"/>
-        </w:rPr>
-        <w:t>Aceptación</w:t>
-      </w:r>
-      <w:proofErr w:type="spellEnd"/>
-      <w:r>
-        <w:rPr>
-          <w:color w:val="2E75B6"/>
-        </w:rPr>
-        <w:t>:</w:t>
+        <w:t>Criterios de Aceptación:</w:t>
       </w:r>
     </w:p>
     <w:p>
@@ -1217,23 +895,7 @@
         <w:pStyle w:val="Listaconvietas"/>
       </w:pPr>
       <w:r>
-        <w:t xml:space="preserve">CA-02: CAPVIGACT-IN + CAPVENCI-IN </w:t>
-      </w:r>
-      <w:proofErr w:type="spellStart"/>
-      <w:r>
-        <w:t>debe</w:t>
-      </w:r>
-      <w:proofErr w:type="spellEnd"/>
-      <w:r>
-        <w:t xml:space="preserve"> ser </w:t>
-      </w:r>
-      <w:proofErr w:type="spellStart"/>
-      <w:r>
-        <w:t>igual</w:t>
-      </w:r>
-      <w:proofErr w:type="spellEnd"/>
-      <w:r>
-        <w:t xml:space="preserve"> a VALSLDACT-IN.</w:t>
+        <w:t>CA-02: CAPVIGACT-IN + CAPVENCI-IN debe ser igual a VALSLDACT-IN.</w:t>
       </w:r>
     </w:p>
     <w:p>
@@ -1290,21 +952,7 @@
         <w:rPr>
           <w:lang w:val="es-CO"/>
         </w:rPr>
-        <w:t xml:space="preserve">Los siguientes casos de prueba están escritos en formato </w:t>
-      </w:r>
-      <w:proofErr w:type="spellStart"/>
-      <w:r>
-        <w:rPr>
-          <w:lang w:val="es-CO"/>
-        </w:rPr>
-        <w:t>Gherkin</w:t>
-      </w:r>
-      <w:proofErr w:type="spellEnd"/>
-      <w:r>
-        <w:rPr>
-          <w:lang w:val="es-CO"/>
-        </w:rPr>
-        <w:t xml:space="preserve"> (Dado que / Cuando / Entonces) y validan los criterios de aceptación de cada historia de usuario.</w:t>
+        <w:t>Los siguientes casos de prueba están escritos en formato Gherkin (Dado que / Cuando / Entonces) y validan los criterios de aceptación de cada historia de usuario.</w:t>
       </w:r>
     </w:p>
     <w:p>
@@ -1406,21 +1054,7 @@
               <w:rPr>
                 <w:lang w:val="es-CO"/>
               </w:rPr>
-              <w:t xml:space="preserve">El archivo de estructura "DetalleTecnico.xlsx" existe en el directorio del proyecto y contiene la hoja </w:t>
-            </w:r>
-            <w:proofErr w:type="spellStart"/>
-            <w:r>
-              <w:rPr>
-                <w:lang w:val="es-CO"/>
-              </w:rPr>
-              <w:t>DetalleTécnico</w:t>
-            </w:r>
-            <w:proofErr w:type="spellEnd"/>
-            <w:r>
-              <w:rPr>
-                <w:lang w:val="es-CO"/>
-              </w:rPr>
-              <w:t xml:space="preserve"> con la definición de los 294 campos de migración.</w:t>
+              <w:t>El archivo de estructura "DetalleTecnico.xlsx" existe en el directorio del proyecto y contiene la hoja DetalleTécnico con la definición de los 294 campos de migración.</w:t>
             </w:r>
           </w:p>
         </w:tc>
@@ -1457,21 +1091,7 @@
               <w:rPr>
                 <w:lang w:val="es-CO"/>
               </w:rPr>
-              <w:t xml:space="preserve">El sistema carga y </w:t>
-            </w:r>
-            <w:proofErr w:type="spellStart"/>
-            <w:r>
-              <w:rPr>
-                <w:lang w:val="es-CO"/>
-              </w:rPr>
-              <w:t>parsea</w:t>
-            </w:r>
-            <w:proofErr w:type="spellEnd"/>
-            <w:r>
-              <w:rPr>
-                <w:lang w:val="es-CO"/>
-              </w:rPr>
-              <w:t xml:space="preserve"> el archivo Excel extrayendo nombre, tipo, longitud, enteros, decimales, obligatoriedad, regla, lista de referencia y datos aceptados de cada campo.</w:t>
+              <w:t>El sistema carga y parsea el archivo Excel extrayendo nombre, tipo, longitud, enteros, decimales, obligatoriedad, regla, lista de referencia y datos aceptados de cada campo.</w:t>
             </w:r>
           </w:p>
         </w:tc>
@@ -1600,6 +1220,7 @@
             </w:r>
             <w:r>
               <w:rPr>
+                <w:noProof/>
                 <w:lang w:val="es-CO"/>
               </w:rPr>
               <w:drawing>
@@ -1828,21 +1449,7 @@
                 <w:lang w:val="es-CO"/>
               </w:rPr>
               <w:lastRenderedPageBreak/>
-              <w:t xml:space="preserve">todos los campos obligatorios deben tener datos válidos (no vacíos, excepto los que tienen regla de "Default espacio" o "Siempre en </w:t>
-            </w:r>
-            <w:proofErr w:type="spellStart"/>
-            <w:r>
-              <w:rPr>
-                <w:lang w:val="es-CO"/>
-              </w:rPr>
-              <w:t>vacio</w:t>
-            </w:r>
-            <w:proofErr w:type="spellEnd"/>
-            <w:r>
-              <w:rPr>
-                <w:lang w:val="es-CO"/>
-              </w:rPr>
-              <w:t>").</w:t>
+              <w:t>todos los campos obligatorios deben tener datos válidos (no vacíos, excepto los que tienen regla de "Default espacio" o "Siempre en vacio").</w:t>
             </w:r>
           </w:p>
         </w:tc>
@@ -2224,13 +1831,8 @@
               </w:rPr>
               <w:t xml:space="preserve">Cada campo ALFANUMERICO debe estar alineado a la izquierda con relleno de espacios a la derecha hasta completar su longitud definida. </w:t>
             </w:r>
-            <w:proofErr w:type="spellStart"/>
-            <w:r>
-              <w:t>Ejemplo</w:t>
-            </w:r>
-            <w:proofErr w:type="spellEnd"/>
-            <w:r>
-              <w:t>: NOMBRECLI-IN (35 chars) = "JUAN PEREZ                         ".</w:t>
+            <w:r>
+              <w:t>Ejemplo: NOMBRECLI-IN (35 chars) = "JUAN PEREZ                         ".</w:t>
             </w:r>
           </w:p>
         </w:tc>
@@ -2501,35 +2103,7 @@
               <w:rPr>
                 <w:lang w:val="es-CO"/>
               </w:rPr>
-              <w:t>Los campos NUMERICO sin decimales deben estar rellenos con ceros a la izquierda (</w:t>
-            </w:r>
-            <w:proofErr w:type="spellStart"/>
-            <w:r>
-              <w:rPr>
-                <w:lang w:val="es-CO"/>
-              </w:rPr>
-              <w:t>ej</w:t>
-            </w:r>
-            <w:proofErr w:type="spellEnd"/>
-            <w:r>
-              <w:rPr>
-                <w:lang w:val="es-CO"/>
-              </w:rPr>
-              <w:t>: "00000012345"). Los campos con decimales deben concatenar enteros + decimales sin separador (</w:t>
-            </w:r>
-            <w:proofErr w:type="spellStart"/>
-            <w:r>
-              <w:rPr>
-                <w:lang w:val="es-CO"/>
-              </w:rPr>
-              <w:t>ej</w:t>
-            </w:r>
-            <w:proofErr w:type="spellEnd"/>
-            <w:r>
-              <w:rPr>
-                <w:lang w:val="es-CO"/>
-              </w:rPr>
-              <w:t>: campo 12,2 → "00000123400").</w:t>
+              <w:t>Los campos NUMERICO sin decimales deben estar rellenos con ceros a la izquierda (ej: "00000012345"). Los campos con decimales deben concatenar enteros + decimales sin separador (ej: campo 12,2 → "00000123400").</w:t>
             </w:r>
           </w:p>
         </w:tc>
@@ -2814,21 +2388,7 @@
               <w:rPr>
                 <w:lang w:val="es-CO"/>
               </w:rPr>
-              <w:t>Todos los campos de fecha deben tener formato AAAAMMDD válido (</w:t>
-            </w:r>
-            <w:proofErr w:type="spellStart"/>
-            <w:r>
-              <w:rPr>
-                <w:lang w:val="es-CO"/>
-              </w:rPr>
-              <w:t>ej</w:t>
-            </w:r>
-            <w:proofErr w:type="spellEnd"/>
-            <w:r>
-              <w:rPr>
-                <w:lang w:val="es-CO"/>
-              </w:rPr>
-              <w:t>: "20250615"). Las fechas "00000000" son válidas solo para campos opcionales con regla "Default cero". Fechas como FECDESEMB-IN, FECFINPACT-IN, FECULTABO-IN deben ser fechas reales válidas.</w:t>
+              <w:t>Todos los campos de fecha deben tener formato AAAAMMDD válido (ej: "20250615"). Las fechas "00000000" son válidas solo para campos opcionales con regla "Default cero". Fechas como FECDESEMB-IN, FECFINPACT-IN, FECULTABO-IN deben ser fechas reales válidas.</w:t>
             </w:r>
           </w:p>
         </w:tc>
@@ -3800,23 +3360,7 @@
               <w:t xml:space="preserve">En cada registro, VALSLDACT-IN debe ser igual a CAPVIGACT-IN + CAPVENCI-IN. </w:t>
             </w:r>
             <w:r>
-              <w:t xml:space="preserve">No se </w:t>
-            </w:r>
-            <w:proofErr w:type="spellStart"/>
-            <w:r>
-              <w:t>permiten</w:t>
-            </w:r>
-            <w:proofErr w:type="spellEnd"/>
-            <w:r>
-              <w:t xml:space="preserve"> </w:t>
-            </w:r>
-            <w:proofErr w:type="spellStart"/>
-            <w:r>
-              <w:t>discrepancias</w:t>
-            </w:r>
-            <w:proofErr w:type="spellEnd"/>
-            <w:r>
-              <w:t>.</w:t>
+              <w:t>No se permiten discrepancias.</w:t>
             </w:r>
           </w:p>
         </w:tc>
@@ -4605,21 +4149,7 @@
               <w:rPr>
                 <w:lang w:val="es-CO"/>
               </w:rPr>
-              <w:t xml:space="preserve">Se extraen CODLINCRE-IN y CLASECAR-IN de cada registro y se valida el mapeo según la hoja </w:t>
-            </w:r>
-            <w:proofErr w:type="spellStart"/>
-            <w:r>
-              <w:rPr>
-                <w:lang w:val="es-CO"/>
-              </w:rPr>
-              <w:t>Lineas</w:t>
-            </w:r>
-            <w:proofErr w:type="spellEnd"/>
-            <w:r>
-              <w:rPr>
-                <w:lang w:val="es-CO"/>
-              </w:rPr>
-              <w:t xml:space="preserve"> del Excel.</w:t>
+              <w:t>Se extraen CODLINCRE-IN y CLASECAR-IN de cada registro y se valida el mapeo según la hoja Lineas del Excel.</w:t>
             </w:r>
           </w:p>
         </w:tc>
@@ -4655,31 +4185,7 @@
               <w:t xml:space="preserve">CLASECAR-IN debe corresponder al mapeo definido: C (Comercial), O (Consumo), H (Vivienda), M (Microcrédito). </w:t>
             </w:r>
             <w:r>
-              <w:t xml:space="preserve">No se </w:t>
-            </w:r>
-            <w:proofErr w:type="spellStart"/>
-            <w:r>
-              <w:t>permiten</w:t>
-            </w:r>
-            <w:proofErr w:type="spellEnd"/>
-            <w:r>
-              <w:t xml:space="preserve"> </w:t>
-            </w:r>
-            <w:proofErr w:type="spellStart"/>
-            <w:r>
-              <w:t>valores</w:t>
-            </w:r>
-            <w:proofErr w:type="spellEnd"/>
-            <w:r>
-              <w:t xml:space="preserve"> fuera de </w:t>
-            </w:r>
-            <w:proofErr w:type="spellStart"/>
-            <w:r>
-              <w:t>este</w:t>
-            </w:r>
-            <w:proofErr w:type="spellEnd"/>
-            <w:r>
-              <w:t xml:space="preserve"> conjunto.</w:t>
+              <w:t>No se permiten valores fuera de este conjunto.</w:t>
             </w:r>
           </w:p>
         </w:tc>
@@ -4727,6 +4233,7 @@
             </w:pPr>
             <w:r>
               <w:rPr>
+                <w:noProof/>
                 <w:lang w:val="es-CO"/>
               </w:rPr>
               <w:drawing>
@@ -4990,6 +4497,7 @@
             </w:pPr>
             <w:r>
               <w:rPr>
+                <w:noProof/>
                 <w:lang w:val="es-CO"/>
               </w:rPr>
               <w:drawing>
@@ -5216,31 +4724,7 @@
               <w:t xml:space="preserve">TIPIDECLI-IN solo debe contener valores válidos: C (Cédula), E (Cédula extranjería), I (Identificación tributaria), J (NIT), L (Licencia), P (Pasaporte), R (Registro civil), T (Tarjeta identidad). </w:t>
             </w:r>
             <w:r>
-              <w:t xml:space="preserve">No se </w:t>
-            </w:r>
-            <w:proofErr w:type="spellStart"/>
-            <w:r>
-              <w:t>permiten</w:t>
-            </w:r>
-            <w:proofErr w:type="spellEnd"/>
-            <w:r>
-              <w:t xml:space="preserve"> </w:t>
-            </w:r>
-            <w:proofErr w:type="spellStart"/>
-            <w:r>
-              <w:t>otros</w:t>
-            </w:r>
-            <w:proofErr w:type="spellEnd"/>
-            <w:r>
-              <w:t xml:space="preserve"> </w:t>
-            </w:r>
-            <w:proofErr w:type="spellStart"/>
-            <w:r>
-              <w:t>valores</w:t>
-            </w:r>
-            <w:proofErr w:type="spellEnd"/>
-            <w:r>
-              <w:t>.</w:t>
+              <w:t>No se permiten otros valores.</w:t>
             </w:r>
           </w:p>
         </w:tc>
@@ -5289,6 +4773,7 @@
             </w:pPr>
             <w:r>
               <w:rPr>
+                <w:noProof/>
                 <w:lang w:val="es-CO"/>
               </w:rPr>
               <w:drawing>
@@ -5431,21 +4916,7 @@
               <w:rPr>
                 <w:lang w:val="es-CO"/>
               </w:rPr>
-              <w:t xml:space="preserve">Se ha generado un archivo plano con al menos 50 registros y la lista DANE está cargada desde la hoja </w:t>
-            </w:r>
-            <w:proofErr w:type="spellStart"/>
-            <w:r>
-              <w:rPr>
-                <w:lang w:val="es-CO"/>
-              </w:rPr>
-              <w:t>CodigoDANE</w:t>
-            </w:r>
-            <w:proofErr w:type="spellEnd"/>
-            <w:r>
-              <w:rPr>
-                <w:lang w:val="es-CO"/>
-              </w:rPr>
-              <w:t xml:space="preserve"> del Excel.</w:t>
+              <w:t>Se ha generado un archivo plano con al menos 50 registros y la lista DANE está cargada desde la hoja CodigoDANE del Excel.</w:t>
             </w:r>
           </w:p>
         </w:tc>
@@ -5514,37 +4985,10 @@
               <w:rPr>
                 <w:lang w:val="es-CO"/>
               </w:rPr>
-              <w:t>CIUCLI-IN debe contener un código DANE real de 5 dígitos (</w:t>
-            </w:r>
-            <w:proofErr w:type="spellStart"/>
-            <w:r>
-              <w:rPr>
-                <w:lang w:val="es-CO"/>
-              </w:rPr>
-              <w:t>padded</w:t>
-            </w:r>
-            <w:proofErr w:type="spellEnd"/>
-            <w:r>
-              <w:rPr>
-                <w:lang w:val="es-CO"/>
-              </w:rPr>
-              <w:t xml:space="preserve"> a 8 con ceros). Debe existir variedad de códigos entre los registros (no todos iguales). </w:t>
-            </w:r>
-            <w:proofErr w:type="spellStart"/>
-            <w:r>
-              <w:t>Ejemplos</w:t>
-            </w:r>
-            <w:proofErr w:type="spellEnd"/>
-            <w:r>
-              <w:t xml:space="preserve"> </w:t>
-            </w:r>
-            <w:proofErr w:type="spellStart"/>
-            <w:r>
-              <w:t>válidos</w:t>
-            </w:r>
-            <w:proofErr w:type="spellEnd"/>
-            <w:r>
-              <w:t>: 76001000 (Cali), 05001000 (Medellín), 11001000 (Bogotá).</w:t>
+              <w:t xml:space="preserve">CIUCLI-IN debe contener un código DANE real de 5 dígitos (padded a 8 con ceros). Debe existir variedad de códigos entre los registros (no todos iguales). </w:t>
+            </w:r>
+            <w:r>
+              <w:t>Ejemplos válidos: 76001000 (Cali), 05001000 (Medellín), 11001000 (Bogotá).</w:t>
             </w:r>
           </w:p>
         </w:tc>
@@ -5593,6 +5037,7 @@
             </w:pPr>
             <w:r>
               <w:rPr>
+                <w:noProof/>
                 <w:lang w:val="es-CO"/>
               </w:rPr>
               <w:drawing>
@@ -5806,39 +5251,7 @@
               <w:t xml:space="preserve">En todos los registros, VALSLDACT-IN (saldo actual) debe ser menor o igual a VALPRESTA-IN (valor del préstamo). </w:t>
             </w:r>
             <w:r>
-              <w:t xml:space="preserve">No se </w:t>
-            </w:r>
-            <w:proofErr w:type="spellStart"/>
-            <w:r>
-              <w:t>permiten</w:t>
-            </w:r>
-            <w:proofErr w:type="spellEnd"/>
-            <w:r>
-              <w:t xml:space="preserve"> </w:t>
-            </w:r>
-            <w:proofErr w:type="spellStart"/>
-            <w:r>
-              <w:t>saldos</w:t>
-            </w:r>
-            <w:proofErr w:type="spellEnd"/>
-            <w:r>
-              <w:t xml:space="preserve"> </w:t>
-            </w:r>
-            <w:proofErr w:type="spellStart"/>
-            <w:r>
-              <w:t>mayores</w:t>
-            </w:r>
-            <w:proofErr w:type="spellEnd"/>
-            <w:r>
-              <w:t xml:space="preserve"> al </w:t>
-            </w:r>
-            <w:proofErr w:type="spellStart"/>
-            <w:r>
-              <w:t>préstamo</w:t>
-            </w:r>
-            <w:proofErr w:type="spellEnd"/>
-            <w:r>
-              <w:t>.</w:t>
+              <w:t>No se permiten saldos mayores al préstamo.</w:t>
             </w:r>
           </w:p>
         </w:tc>
@@ -5887,6 +5300,7 @@
             </w:pPr>
             <w:r>
               <w:rPr>
+                <w:noProof/>
                 <w:lang w:val="es-CO"/>
               </w:rPr>
               <w:drawing>
@@ -5963,25 +5377,7 @@
                 <w:color w:val="FFFFFF" w:themeColor="background1"/>
                 <w:sz w:val="24"/>
               </w:rPr>
-              <w:t xml:space="preserve">CP-016 — Validar FACTLMOR </w:t>
-            </w:r>
-            <w:proofErr w:type="spellStart"/>
-            <w:r>
-              <w:rPr>
-                <w:b/>
-                <w:color w:val="FFFFFF" w:themeColor="background1"/>
-                <w:sz w:val="24"/>
-              </w:rPr>
-              <w:t>siempre</w:t>
-            </w:r>
-            <w:proofErr w:type="spellEnd"/>
-            <w:r>
-              <w:rPr>
-                <w:b/>
-                <w:color w:val="FFFFFF" w:themeColor="background1"/>
-                <w:sz w:val="24"/>
-              </w:rPr>
-              <w:t xml:space="preserve"> 365</w:t>
+              <w:t>CP-016 — Validar FACTLMOR siempre 365</w:t>
             </w:r>
           </w:p>
         </w:tc>
@@ -6119,21 +5515,7 @@
               <w:rPr>
                 <w:lang w:val="es-CO"/>
               </w:rPr>
-              <w:t xml:space="preserve">FACTLMOR-IN debe ser "0000000000000365" (365 con </w:t>
-            </w:r>
-            <w:proofErr w:type="spellStart"/>
-            <w:r>
-              <w:rPr>
-                <w:lang w:val="es-CO"/>
-              </w:rPr>
-              <w:t>padding</w:t>
-            </w:r>
-            <w:proofErr w:type="spellEnd"/>
-            <w:r>
-              <w:rPr>
-                <w:lang w:val="es-CO"/>
-              </w:rPr>
-              <w:t xml:space="preserve"> de ceros) en todos los registros, sin excepción.</w:t>
+              <w:t>FACTLMOR-IN debe ser "0000000000000365" (365 con padding de ceros) en todos los registros, sin excepción.</w:t>
             </w:r>
           </w:p>
         </w:tc>
@@ -6181,6 +5563,7 @@
             </w:pPr>
             <w:r>
               <w:rPr>
+                <w:noProof/>
                 <w:lang w:val="es-CO"/>
               </w:rPr>
               <w:drawing>
@@ -6365,21 +5748,7 @@
               <w:rPr>
                 <w:lang w:val="es-CO"/>
               </w:rPr>
-              <w:t xml:space="preserve">Se ejecuta el escenario </w:t>
-            </w:r>
-            <w:proofErr w:type="spellStart"/>
-            <w:r>
-              <w:rPr>
-                <w:lang w:val="es-CO"/>
-              </w:rPr>
-              <w:t>Gherkin</w:t>
-            </w:r>
-            <w:proofErr w:type="spellEnd"/>
-            <w:r>
-              <w:rPr>
-                <w:lang w:val="es-CO"/>
-              </w:rPr>
-              <w:t xml:space="preserve"> parametrizado con cantidad = 5 registros.</w:t>
+              <w:t>Se ejecuta el escenario Gherkin parametrizado con cantidad = 5 registros.</w:t>
             </w:r>
           </w:p>
         </w:tc>
@@ -6657,21 +6026,7 @@
               <w:rPr>
                 <w:lang w:val="es-CO"/>
               </w:rPr>
-              <w:t xml:space="preserve">Se ejecuta el escenario </w:t>
-            </w:r>
-            <w:proofErr w:type="spellStart"/>
-            <w:r>
-              <w:rPr>
-                <w:lang w:val="es-CO"/>
-              </w:rPr>
-              <w:t>Gherkin</w:t>
-            </w:r>
-            <w:proofErr w:type="spellEnd"/>
-            <w:r>
-              <w:rPr>
-                <w:lang w:val="es-CO"/>
-              </w:rPr>
-              <w:t xml:space="preserve"> parametrizado con cantidad = 50 registros.</w:t>
+              <w:t>Se ejecuta el escenario Gherkin parametrizado con cantidad = 50 registros.</w:t>
             </w:r>
           </w:p>
         </w:tc>
@@ -6949,21 +6304,7 @@
               <w:rPr>
                 <w:lang w:val="es-CO"/>
               </w:rPr>
-              <w:t xml:space="preserve">Se ejecuta el escenario </w:t>
-            </w:r>
-            <w:proofErr w:type="spellStart"/>
-            <w:r>
-              <w:rPr>
-                <w:lang w:val="es-CO"/>
-              </w:rPr>
-              <w:t>Gherkin</w:t>
-            </w:r>
-            <w:proofErr w:type="spellEnd"/>
-            <w:r>
-              <w:rPr>
-                <w:lang w:val="es-CO"/>
-              </w:rPr>
-              <w:t xml:space="preserve"> parametrizado con cantidad = 200 registros.</w:t>
+              <w:t>Se ejecuta el escenario Gherkin parametrizado con cantidad = 200 registros.</w:t>
             </w:r>
           </w:p>
         </w:tc>
@@ -7124,13 +6465,7 @@
         <w:rPr>
           <w:lang w:val="es-CO"/>
         </w:rPr>
-        <w:t>L</w:t>
-      </w:r>
-      <w:r>
-        <w:rPr>
-          <w:lang w:val="es-CO"/>
-        </w:rPr>
-        <w:t>a siguiente matriz relaciona cada caso de prueba con las historias de usuario y criterios de aceptación que valida.</w:t>
+        <w:t>La siguiente matriz relaciona cada caso de prueba con las historias de usuario y criterios de aceptación que valida.</w:t>
       </w:r>
     </w:p>
     <w:tbl>
@@ -7165,18 +6500,27 @@
                 <w:color w:val="FFFFFF"/>
                 <w:sz w:val="20"/>
               </w:rPr>
-              <w:t xml:space="preserve">Caso de </w:t>
-            </w:r>
-            <w:proofErr w:type="spellStart"/>
+              <w:t>Caso de Prueba</w:t>
+            </w:r>
+          </w:p>
+        </w:tc>
+        <w:tc>
+          <w:tcPr>
+            <w:tcW w:w="2160" w:type="dxa"/>
+            <w:shd w:val="clear" w:color="auto" w:fill="2E75B6"/>
+          </w:tcPr>
+          <w:p>
+            <w:pPr>
+              <w:jc w:val="center"/>
+            </w:pPr>
             <w:r>
               <w:rPr>
                 <w:b/>
                 <w:color w:val="FFFFFF"/>
                 <w:sz w:val="20"/>
               </w:rPr>
-              <w:t>Prueba</w:t>
-            </w:r>
-            <w:proofErr w:type="spellEnd"/>
+              <w:t>Historia</w:t>
+            </w:r>
           </w:p>
         </w:tc>
         <w:tc>
@@ -7194,29 +6538,8 @@
                 <w:color w:val="FFFFFF"/>
                 <w:sz w:val="20"/>
               </w:rPr>
-              <w:t>Historia</w:t>
-            </w:r>
-          </w:p>
-        </w:tc>
-        <w:tc>
-          <w:tcPr>
-            <w:tcW w:w="2160" w:type="dxa"/>
-            <w:shd w:val="clear" w:color="auto" w:fill="2E75B6"/>
-          </w:tcPr>
-          <w:p>
-            <w:pPr>
-              <w:jc w:val="center"/>
-            </w:pPr>
-            <w:proofErr w:type="spellStart"/>
-            <w:r>
-              <w:rPr>
-                <w:b/>
-                <w:color w:val="FFFFFF"/>
-                <w:sz w:val="20"/>
-              </w:rPr>
               <w:t>Criterios</w:t>
             </w:r>
-            <w:proofErr w:type="spellEnd"/>
           </w:p>
         </w:tc>
         <w:tc>
@@ -7300,14 +6623,12 @@
             <w:pPr>
               <w:jc w:val="center"/>
             </w:pPr>
-            <w:proofErr w:type="spellStart"/>
             <w:r>
               <w:rPr>
                 <w:sz w:val="20"/>
               </w:rPr>
               <w:t>Aprobado</w:t>
             </w:r>
-            <w:proofErr w:type="spellEnd"/>
           </w:p>
         </w:tc>
       </w:tr>
@@ -7372,14 +6693,12 @@
             <w:pPr>
               <w:jc w:val="center"/>
             </w:pPr>
-            <w:proofErr w:type="spellStart"/>
             <w:r>
               <w:rPr>
                 <w:sz w:val="20"/>
               </w:rPr>
               <w:t>Aprobado</w:t>
             </w:r>
-            <w:proofErr w:type="spellEnd"/>
           </w:p>
         </w:tc>
       </w:tr>
@@ -7444,14 +6763,12 @@
             <w:pPr>
               <w:jc w:val="center"/>
             </w:pPr>
-            <w:proofErr w:type="spellStart"/>
             <w:r>
               <w:rPr>
                 <w:sz w:val="20"/>
               </w:rPr>
               <w:t>Aprobado</w:t>
             </w:r>
-            <w:proofErr w:type="spellEnd"/>
           </w:p>
         </w:tc>
       </w:tr>
@@ -7516,14 +6833,12 @@
             <w:pPr>
               <w:jc w:val="center"/>
             </w:pPr>
-            <w:proofErr w:type="spellStart"/>
             <w:r>
               <w:rPr>
                 <w:sz w:val="20"/>
               </w:rPr>
               <w:t>Aprobado</w:t>
             </w:r>
-            <w:proofErr w:type="spellEnd"/>
           </w:p>
         </w:tc>
       </w:tr>
@@ -7588,14 +6903,12 @@
             <w:pPr>
               <w:jc w:val="center"/>
             </w:pPr>
-            <w:proofErr w:type="spellStart"/>
             <w:r>
               <w:rPr>
                 <w:sz w:val="20"/>
               </w:rPr>
               <w:t>Aprobado</w:t>
             </w:r>
-            <w:proofErr w:type="spellEnd"/>
           </w:p>
         </w:tc>
       </w:tr>
@@ -7660,14 +6973,12 @@
             <w:pPr>
               <w:jc w:val="center"/>
             </w:pPr>
-            <w:proofErr w:type="spellStart"/>
             <w:r>
               <w:rPr>
                 <w:sz w:val="20"/>
               </w:rPr>
               <w:t>Aprobado</w:t>
             </w:r>
-            <w:proofErr w:type="spellEnd"/>
           </w:p>
         </w:tc>
       </w:tr>
@@ -7732,14 +7043,12 @@
             <w:pPr>
               <w:jc w:val="center"/>
             </w:pPr>
-            <w:proofErr w:type="spellStart"/>
             <w:r>
               <w:rPr>
                 <w:sz w:val="20"/>
               </w:rPr>
               <w:t>Aprobado</w:t>
             </w:r>
-            <w:proofErr w:type="spellEnd"/>
           </w:p>
         </w:tc>
       </w:tr>
@@ -7804,14 +7113,12 @@
             <w:pPr>
               <w:jc w:val="center"/>
             </w:pPr>
-            <w:proofErr w:type="spellStart"/>
             <w:r>
               <w:rPr>
                 <w:sz w:val="20"/>
               </w:rPr>
               <w:t>Aprobado</w:t>
             </w:r>
-            <w:proofErr w:type="spellEnd"/>
           </w:p>
         </w:tc>
       </w:tr>
@@ -7876,14 +7183,12 @@
             <w:pPr>
               <w:jc w:val="center"/>
             </w:pPr>
-            <w:proofErr w:type="spellStart"/>
             <w:r>
               <w:rPr>
                 <w:sz w:val="20"/>
               </w:rPr>
               <w:t>Aprobado</w:t>
             </w:r>
-            <w:proofErr w:type="spellEnd"/>
           </w:p>
         </w:tc>
       </w:tr>
@@ -7948,14 +7253,12 @@
             <w:pPr>
               <w:jc w:val="center"/>
             </w:pPr>
-            <w:proofErr w:type="spellStart"/>
             <w:r>
               <w:rPr>
                 <w:sz w:val="20"/>
               </w:rPr>
               <w:t>Aprobado</w:t>
             </w:r>
-            <w:proofErr w:type="spellEnd"/>
           </w:p>
         </w:tc>
       </w:tr>
@@ -8020,14 +7323,12 @@
             <w:pPr>
               <w:jc w:val="center"/>
             </w:pPr>
-            <w:proofErr w:type="spellStart"/>
             <w:r>
               <w:rPr>
                 <w:sz w:val="20"/>
               </w:rPr>
               <w:t>Aprobado</w:t>
             </w:r>
-            <w:proofErr w:type="spellEnd"/>
           </w:p>
         </w:tc>
       </w:tr>
@@ -8092,14 +7393,12 @@
             <w:pPr>
               <w:jc w:val="center"/>
             </w:pPr>
-            <w:proofErr w:type="spellStart"/>
             <w:r>
               <w:rPr>
                 <w:sz w:val="20"/>
               </w:rPr>
               <w:t>Aprobado</w:t>
             </w:r>
-            <w:proofErr w:type="spellEnd"/>
           </w:p>
         </w:tc>
       </w:tr>
@@ -8164,14 +7463,12 @@
             <w:pPr>
               <w:jc w:val="center"/>
             </w:pPr>
-            <w:proofErr w:type="spellStart"/>
             <w:r>
               <w:rPr>
                 <w:sz w:val="20"/>
               </w:rPr>
               <w:t>Aprobado</w:t>
             </w:r>
-            <w:proofErr w:type="spellEnd"/>
           </w:p>
         </w:tc>
       </w:tr>
@@ -8236,14 +7533,12 @@
             <w:pPr>
               <w:jc w:val="center"/>
             </w:pPr>
-            <w:proofErr w:type="spellStart"/>
             <w:r>
               <w:rPr>
                 <w:sz w:val="20"/>
               </w:rPr>
               <w:t>Aprobado</w:t>
             </w:r>
-            <w:proofErr w:type="spellEnd"/>
           </w:p>
         </w:tc>
       </w:tr>
@@ -8308,14 +7603,12 @@
             <w:pPr>
               <w:jc w:val="center"/>
             </w:pPr>
-            <w:proofErr w:type="spellStart"/>
             <w:r>
               <w:rPr>
                 <w:sz w:val="20"/>
               </w:rPr>
               <w:t>Aprobado</w:t>
             </w:r>
-            <w:proofErr w:type="spellEnd"/>
           </w:p>
         </w:tc>
       </w:tr>
@@ -8380,14 +7673,12 @@
             <w:pPr>
               <w:jc w:val="center"/>
             </w:pPr>
-            <w:proofErr w:type="spellStart"/>
             <w:r>
               <w:rPr>
                 <w:sz w:val="20"/>
               </w:rPr>
               <w:t>Aprobado</w:t>
             </w:r>
-            <w:proofErr w:type="spellEnd"/>
           </w:p>
         </w:tc>
       </w:tr>
@@ -8452,14 +7743,12 @@
             <w:pPr>
               <w:jc w:val="center"/>
             </w:pPr>
-            <w:proofErr w:type="spellStart"/>
             <w:r>
               <w:rPr>
                 <w:sz w:val="20"/>
               </w:rPr>
               <w:t>Aprobado</w:t>
             </w:r>
-            <w:proofErr w:type="spellEnd"/>
           </w:p>
         </w:tc>
       </w:tr>
@@ -8524,14 +7813,12 @@
             <w:pPr>
               <w:jc w:val="center"/>
             </w:pPr>
-            <w:proofErr w:type="spellStart"/>
             <w:r>
               <w:rPr>
                 <w:sz w:val="20"/>
               </w:rPr>
               <w:t>Aprobado</w:t>
             </w:r>
-            <w:proofErr w:type="spellEnd"/>
           </w:p>
         </w:tc>
       </w:tr>
@@ -8596,14 +7883,12 @@
             <w:pPr>
               <w:jc w:val="center"/>
             </w:pPr>
-            <w:proofErr w:type="spellStart"/>
             <w:r>
               <w:rPr>
                 <w:sz w:val="20"/>
               </w:rPr>
               <w:t>Aprobado</w:t>
             </w:r>
-            <w:proofErr w:type="spellEnd"/>
           </w:p>
         </w:tc>
       </w:tr>
@@ -8619,30 +7904,8 @@
           <w:color w:val="2E75B6"/>
         </w:rPr>
         <w:lastRenderedPageBreak/>
-        <w:t xml:space="preserve">6. </w:t>
+        <w:t>6. Resultados de Ejecución</w:t>
       </w:r>
-      <w:proofErr w:type="spellStart"/>
-      <w:r>
-        <w:rPr>
-          <w:color w:val="2E75B6"/>
-        </w:rPr>
-        <w:t>Resultados</w:t>
-      </w:r>
-      <w:proofErr w:type="spellEnd"/>
-      <w:r>
-        <w:rPr>
-          <w:color w:val="2E75B6"/>
-        </w:rPr>
-        <w:t xml:space="preserve"> de </w:t>
-      </w:r>
-      <w:proofErr w:type="spellStart"/>
-      <w:r>
-        <w:rPr>
-          <w:color w:val="2E75B6"/>
-        </w:rPr>
-        <w:t>Ejecución</w:t>
-      </w:r>
-      <w:proofErr w:type="spellEnd"/>
     </w:p>
     <w:p>
       <w:pPr>
@@ -8654,49 +7917,7 @@
         <w:rPr>
           <w:lang w:val="es-CO"/>
         </w:rPr>
-        <w:t xml:space="preserve">La ejecución de los </w:t>
-      </w:r>
-      <w:proofErr w:type="spellStart"/>
-      <w:r>
-        <w:rPr>
-          <w:lang w:val="es-CO"/>
-        </w:rPr>
-        <w:t>tests</w:t>
-      </w:r>
-      <w:proofErr w:type="spellEnd"/>
-      <w:r>
-        <w:rPr>
-          <w:lang w:val="es-CO"/>
-        </w:rPr>
-        <w:t xml:space="preserve"> automatizados vía </w:t>
-      </w:r>
-      <w:proofErr w:type="spellStart"/>
-      <w:r>
-        <w:rPr>
-          <w:lang w:val="es-CO"/>
-        </w:rPr>
-        <w:t>Cucumber</w:t>
-      </w:r>
-      <w:proofErr w:type="spellEnd"/>
-      <w:r>
-        <w:rPr>
-          <w:lang w:val="es-CO"/>
-        </w:rPr>
-        <w:t>/</w:t>
-      </w:r>
-      <w:proofErr w:type="spellStart"/>
-      <w:r>
-        <w:rPr>
-          <w:lang w:val="es-CO"/>
-        </w:rPr>
-        <w:t>Gherkin</w:t>
-      </w:r>
-      <w:proofErr w:type="spellEnd"/>
-      <w:r>
-        <w:rPr>
-          <w:lang w:val="es-CO"/>
-        </w:rPr>
-        <w:t xml:space="preserve"> arroja los siguientes resultados:</w:t>
+        <w:t>La ejecución de los tests automatizados vía Cucumber/Gherkin arroja los siguientes resultados:</w:t>
       </w:r>
     </w:p>
     <w:tbl>
@@ -8724,7 +7945,6 @@
             <w:pPr>
               <w:jc w:val="center"/>
             </w:pPr>
-            <w:proofErr w:type="spellStart"/>
             <w:r>
               <w:rPr>
                 <w:b/>
@@ -8732,7 +7952,6 @@
               </w:rPr>
               <w:t>Métrica</w:t>
             </w:r>
-            <w:proofErr w:type="spellEnd"/>
           </w:p>
         </w:tc>
         <w:tc>
@@ -8768,13 +7987,8 @@
               <w:jc w:val="center"/>
             </w:pPr>
             <w:r>
-              <w:t xml:space="preserve">Tests </w:t>
-            </w:r>
-            <w:proofErr w:type="spellStart"/>
-            <w:r>
-              <w:t>ejecutados</w:t>
-            </w:r>
-            <w:proofErr w:type="spellEnd"/>
+              <w:t>Tests ejecutados</w:t>
+            </w:r>
           </w:p>
         </w:tc>
         <w:tc>
@@ -8805,13 +8019,8 @@
               <w:jc w:val="center"/>
             </w:pPr>
             <w:r>
-              <w:t xml:space="preserve">Tests </w:t>
-            </w:r>
-            <w:proofErr w:type="spellStart"/>
-            <w:r>
-              <w:t>aprobados</w:t>
-            </w:r>
-            <w:proofErr w:type="spellEnd"/>
+              <w:t>Tests aprobados</w:t>
+            </w:r>
           </w:p>
         </w:tc>
         <w:tc>
@@ -8842,13 +8051,8 @@
               <w:jc w:val="center"/>
             </w:pPr>
             <w:r>
-              <w:t xml:space="preserve">Tests </w:t>
-            </w:r>
-            <w:proofErr w:type="spellStart"/>
-            <w:r>
-              <w:t>fallidos</w:t>
-            </w:r>
-            <w:proofErr w:type="spellEnd"/>
+              <w:t>Tests fallidos</w:t>
+            </w:r>
           </w:p>
         </w:tc>
         <w:tc>
@@ -8914,10 +8118,10 @@
                 <w:b/>
               </w:rPr>
               <w:drawing>
-                <wp:inline distT="0" distB="0" distL="0" distR="0" wp14:anchorId="148E9DBE" wp14:editId="01E1F93D">
-                  <wp:extent cx="5378171" cy="2828260"/>
+                <wp:inline distT="0" distB="0" distL="0" distR="0" wp14:anchorId="60972BAA" wp14:editId="2273112B">
+                  <wp:extent cx="5486400" cy="1889125"/>
                   <wp:effectExtent l="0" t="0" r="0" b="0"/>
-                  <wp:docPr id="1757050000" name="Imagen 1"/>
+                  <wp:docPr id="1511631790" name="Imagen 1"/>
                   <wp:cNvGraphicFramePr>
                     <a:graphicFrameLocks xmlns:a="http://schemas.openxmlformats.org/drawingml/2006/main" noChangeAspect="1"/>
                   </wp:cNvGraphicFramePr>
@@ -8925,7 +8129,7 @@
                     <a:graphicData uri="http://schemas.openxmlformats.org/drawingml/2006/picture">
                       <pic:pic xmlns:pic="http://schemas.openxmlformats.org/drawingml/2006/picture">
                         <pic:nvPicPr>
-                          <pic:cNvPr id="1757050000" name=""/>
+                          <pic:cNvPr id="1511631790" name=""/>
                           <pic:cNvPicPr/>
                         </pic:nvPicPr>
                         <pic:blipFill>
@@ -8937,7 +8141,7 @@
                         <pic:spPr>
                           <a:xfrm>
                             <a:off x="0" y="0"/>
-                            <a:ext cx="5479005" cy="2881286"/>
+                            <a:ext cx="5486400" cy="1889125"/>
                           </a:xfrm>
                           <a:prstGeom prst="rect">
                             <a:avLst/>
@@ -8962,6 +8166,7 @@
             <w:r>
               <w:rPr>
                 <w:b/>
+                <w:noProof/>
               </w:rPr>
               <w:drawing>
                 <wp:inline distT="0" distB="0" distL="0" distR="0" wp14:anchorId="146452C3" wp14:editId="67C7B9FC">
@@ -9014,21 +8219,7 @@
         <w:rPr>
           <w:lang w:val="es-CO"/>
         </w:rPr>
-        <w:t xml:space="preserve">Resultado: BUILD SUCCESS — Todos los escenarios </w:t>
-      </w:r>
-      <w:proofErr w:type="spellStart"/>
-      <w:r>
-        <w:rPr>
-          <w:lang w:val="es-CO"/>
-        </w:rPr>
-        <w:t>Cucumber</w:t>
-      </w:r>
-      <w:proofErr w:type="spellEnd"/>
-      <w:r>
-        <w:rPr>
-          <w:lang w:val="es-CO"/>
-        </w:rPr>
-        <w:t xml:space="preserve"> pasaron exitosamente.</w:t>
+        <w:t>Resultado: BUILD SUCCESS — Todos los escenarios Cucumber pasaron exitosamente.</w:t>
       </w:r>
     </w:p>
     <w:sectPr>

</xml_diff>